<commit_message>
Lab2: replace manual TOC with a real Word TOC field (indexation)
</commit_message>
<xml_diff>
--- a/Lab2/Lab2_PlesuDinu_FAF-241.docx
+++ b/Lab2/Lab2_PlesuDinu_FAF-241.docx
@@ -232,152 +232,80 @@
     </w:p>
     <w:p>
       <w:pPr>
-        <w:spacing w:after="50" w:line="270" w:lineRule="auto"/>
-        <w:tabs>
-          <w:tab w:val="right" w:leader="dot" w:pos="9000"/>
-        </w:tabs>
-      </w:pPr>
-      <w:r>
-        <w:rPr>
-          <w:sz w:val="20"/>
-          <w:szCs w:val="20"/>
-        </w:rPr>
-        <w:t xml:space="preserve">1 Purpose of the Work</w:t>
-      </w:r>
-      <w:r>
-        <w:tab/>
-      </w:r>
-      <w:r>
-        <w:rPr>
-          <w:sz w:val="20"/>
-          <w:szCs w:val="20"/>
-        </w:rPr>
-        <w:t xml:space="preserve">3</w:t>
-      </w:r>
-    </w:p>
-    <w:p>
-      <w:pPr>
-        <w:spacing w:after="50" w:line="270" w:lineRule="auto"/>
-        <w:tabs>
-          <w:tab w:val="right" w:leader="dot" w:pos="9000"/>
-        </w:tabs>
-      </w:pPr>
-      <w:r>
-        <w:rPr>
-          <w:sz w:val="20"/>
-          <w:szCs w:val="20"/>
-        </w:rPr>
-        <w:t xml:space="preserve">2 Part 1 – Build and boot</w:t>
-      </w:r>
-      <w:r>
-        <w:tab/>
-      </w:r>
-      <w:r>
-        <w:rPr>
-          <w:sz w:val="20"/>
-          <w:szCs w:val="20"/>
-        </w:rPr>
-        <w:t xml:space="preserve">3</w:t>
-      </w:r>
-    </w:p>
-    <w:p>
-      <w:pPr>
-        <w:spacing w:after="50" w:line="270" w:lineRule="auto"/>
-        <w:tabs>
-          <w:tab w:val="right" w:leader="dot" w:pos="9000"/>
-        </w:tabs>
-      </w:pPr>
-      <w:r>
-        <w:rPr>
-          <w:sz w:val="20"/>
-          <w:szCs w:val="20"/>
-        </w:rPr>
-        <w:t xml:space="preserve">3 Part 2 – Use xv6</w:t>
-      </w:r>
-      <w:r>
-        <w:tab/>
-      </w:r>
-      <w:r>
-        <w:rPr>
-          <w:sz w:val="20"/>
-          <w:szCs w:val="20"/>
-        </w:rPr>
-        <w:t xml:space="preserve">3</w:t>
-      </w:r>
-    </w:p>
-    <w:p>
-      <w:pPr>
-        <w:spacing w:after="50" w:line="270" w:lineRule="auto"/>
-        <w:tabs>
-          <w:tab w:val="right" w:leader="dot" w:pos="9000"/>
-        </w:tabs>
-      </w:pPr>
-      <w:r>
-        <w:rPr>
-          <w:sz w:val="20"/>
-          <w:szCs w:val="20"/>
-        </w:rPr>
-        <w:t xml:space="preserve">4 Part 3 – Read the source</w:t>
-      </w:r>
-      <w:r>
-        <w:tab/>
-      </w:r>
-      <w:r>
-        <w:rPr>
-          <w:sz w:val="20"/>
-          <w:szCs w:val="20"/>
-        </w:rPr>
-        <w:t xml:space="preserve">3</w:t>
-      </w:r>
-    </w:p>
-    <w:p>
-      <w:pPr>
-        <w:spacing w:after="50" w:line="270" w:lineRule="auto"/>
-        <w:tabs>
-          <w:tab w:val="right" w:leader="dot" w:pos="9000"/>
-        </w:tabs>
-      </w:pPr>
-      <w:r>
-        <w:rPr>
-          <w:sz w:val="20"/>
-          <w:szCs w:val="20"/>
-        </w:rPr>
-        <w:t xml:space="preserve">5 Part 4 – First xv6 program</w:t>
-      </w:r>
-      <w:r>
-        <w:tab/>
-      </w:r>
-      <w:r>
-        <w:rPr>
-          <w:sz w:val="20"/>
-          <w:szCs w:val="20"/>
-        </w:rPr>
-        <w:t xml:space="preserve">4</w:t>
-      </w:r>
-    </w:p>
-    <w:p>
-      <w:pPr>
-        <w:spacing w:after="50" w:line="270" w:lineRule="auto"/>
-        <w:tabs>
-          <w:tab w:val="right" w:leader="dot" w:pos="9000"/>
-        </w:tabs>
-      </w:pPr>
-      <w:r>
-        <w:rPr>
-          <w:sz w:val="20"/>
-          <w:szCs w:val="20"/>
-        </w:rPr>
-        <w:t xml:space="preserve">6 Conclusion</w:t>
-      </w:r>
-      <w:r>
-        <w:tab/>
-      </w:r>
-      <w:r>
-        <w:rPr>
-          <w:sz w:val="20"/>
-          <w:szCs w:val="20"/>
-        </w:rPr>
-        <w:t xml:space="preserve">5</w:t>
+        <w:spacing w:after="130"/>
+      </w:pPr>
+      <w:r>
+        <w:fldChar w:fldCharType="begin" w:dirty="true"/>
+      </w:r>
+      <w:r>
+        <w:instrText xml:space="preserve"> TOC \o "1-2" \h \z \u </w:instrText>
+      </w:r>
+      <w:r>
+        <w:fldChar w:fldCharType="separate"/>
+      </w:r>
+      <w:r>
+        <w:rPr>
+          <w:sz w:val="20"/>
+        </w:rPr>
+        <w:t>1.  Purpose of the Work</w:t>
+      </w:r>
+    </w:p>
+    <w:p>
+      <w:pPr>
+        <w:spacing w:after="130"/>
+      </w:pPr>
+      <w:r>
+        <w:rPr>
+          <w:sz w:val="20"/>
+        </w:rPr>
+        <w:t>2.  Part 1 – Build and boot</w:t>
+      </w:r>
+    </w:p>
+    <w:p>
+      <w:pPr>
+        <w:spacing w:after="130"/>
+      </w:pPr>
+      <w:r>
+        <w:rPr>
+          <w:sz w:val="20"/>
+        </w:rPr>
+        <w:t>3.  Part 2 – Use xv</w:t>
+      </w:r>
+    </w:p>
+    <w:p>
+      <w:pPr>
+        <w:spacing w:after="130"/>
+      </w:pPr>
+      <w:r>
+        <w:rPr>
+          <w:sz w:val="20"/>
+        </w:rPr>
+        <w:t>4.  Part 3 – Read the source</w:t>
+      </w:r>
+    </w:p>
+    <w:p>
+      <w:pPr>
+        <w:spacing w:after="130"/>
+      </w:pPr>
+      <w:r>
+        <w:rPr>
+          <w:sz w:val="20"/>
+        </w:rPr>
+        <w:t>5.  Part 4 – First xv6 program</w:t>
+      </w:r>
+    </w:p>
+    <w:p>
+      <w:pPr>
+        <w:spacing w:after="130"/>
+      </w:pPr>
+      <w:r>
+        <w:rPr>
+          <w:sz w:val="20"/>
+        </w:rPr>
+        <w:t>6.  Conclusion</w:t>
+      </w:r>
+      <w:r>
+        <w:fldChar w:fldCharType="end"/>
       </w:r>
     </w:p>
     <w:p>
@@ -394,6 +322,7 @@
       </w:r>
     </w:p>
     <w:p>
+      <w:bookmarkStart w:id="1001" w:name="_Toc1001"/>
       <w:pPr>
         <w:pStyle w:val="Heading1"/>
         <w:jc w:val="left"/>
@@ -408,6 +337,7 @@
         <w:t xml:space="preserve">1.  Purpose of the Work</w:t>
       </w:r>
       <w:bookmarkEnd w:id="2"/>
+      <w:bookmarkEnd w:id="1001"/>
     </w:p>
     <w:p>
       <w:pPr>
@@ -430,6 +360,7 @@
       </w:r>
     </w:p>
     <w:p>
+      <w:bookmarkStart w:id="1002" w:name="_Toc1002"/>
       <w:pPr>
         <w:pStyle w:val="Heading1"/>
         <w:jc w:val="left"/>
@@ -444,6 +375,7 @@
         <w:t xml:space="preserve">2.  Part 1 – Build and boot</w:t>
       </w:r>
       <w:bookmarkEnd w:id="3"/>
+      <w:bookmarkEnd w:id="1002"/>
     </w:p>
     <w:p>
       <w:pPr>
@@ -477,6 +409,7 @@
       </w:r>
     </w:p>
     <w:p>
+      <w:bookmarkStart w:id="1003" w:name="_Toc1003"/>
       <w:pPr>
         <w:pStyle w:val="Heading1"/>
         <w:jc w:val="left"/>
@@ -491,6 +424,7 @@
         <w:t xml:space="preserve">3.  Part 2 – Use xv6</w:t>
       </w:r>
       <w:bookmarkEnd w:id="4"/>
+      <w:bookmarkEnd w:id="1003"/>
     </w:p>
     <w:p>
       <w:pPr>
@@ -556,6 +490,7 @@
       </w:r>
     </w:p>
     <w:p>
+      <w:bookmarkStart w:id="1004" w:name="_Toc1004"/>
       <w:pPr>
         <w:pStyle w:val="Heading1"/>
         <w:jc w:val="left"/>
@@ -570,6 +505,7 @@
         <w:t xml:space="preserve">4.  Part 3 – Read the source</w:t>
       </w:r>
       <w:bookmarkEnd w:id="5"/>
+      <w:bookmarkEnd w:id="1004"/>
     </w:p>
     <w:p>
       <w:pPr>
@@ -757,6 +693,7 @@
       </w:r>
     </w:p>
     <w:p>
+      <w:bookmarkStart w:id="1005" w:name="_Toc1005"/>
       <w:pPr>
         <w:pStyle w:val="Heading1"/>
         <w:jc w:val="left"/>
@@ -771,6 +708,7 @@
         <w:t xml:space="preserve">5.  Part 4 – First xv6 program</w:t>
       </w:r>
       <w:bookmarkEnd w:id="6"/>
+      <w:bookmarkEnd w:id="1005"/>
     </w:p>
     <w:p>
       <w:pPr>
@@ -920,6 +858,7 @@
       </w:r>
     </w:p>
     <w:p>
+      <w:bookmarkStart w:id="1006" w:name="_Toc1006"/>
       <w:pPr>
         <w:pStyle w:val="Heading1"/>
         <w:jc w:val="left"/>
@@ -934,6 +873,7 @@
         <w:t xml:space="preserve">6.  Conclusion</w:t>
       </w:r>
       <w:bookmarkEnd w:id="7"/>
+      <w:bookmarkEnd w:id="1006"/>
     </w:p>
     <w:p>
       <w:pPr>

</xml_diff>